<commit_message>
docs: 更新 M1-β 进度报告(HMAC/队列/导入/UiaProbe/CI,71 测试,15→提交)并重导 docx/pdf
- 执行摘要/交付物/组件表/验证证据/§9 全部同步到 71 测试、9 工程、15 提交
- 新增 §4.4 sig-smoke 端到端联调证据;补 UiaProbe/M2 校准手册/OCR 引擎条目
</commit_message>
<xml_diff>
--- a/docs/M1-β进度与验证报告.docx
+++ b/docs/M1-β进度与验证报告.docx
@@ -40,7 +40,7 @@
         <w:rPr>
           <w:rFonts w:ascii="Arial" w:eastAsia="Microsoft YaHei"/>
         </w:rPr>
-        <w:t xml:space="preserve">阶段：M1-α → M1-β（Host 可运行骨架 + 评审修复 + 组合根配置化 + 音频串流并入）</w:t>
+        <w:t xml:space="preserve">阶段：M1-α → M1-β（Host 可运行骨架 + 评审修复 + 组合根/音频串流 + HMAC 签名 + 队列/导入 + 校准工具 + CI）</w:t>
       </w:r>
     </w:p>
     <w:p>
@@ -55,7 +55,7 @@
         <w:rPr>
           <w:rFonts w:ascii="Arial" w:eastAsia="Microsoft YaHei"/>
         </w:rPr>
-        <w:t xml:space="preserve">报告日期：2026-10-04</w:t>
+        <w:t xml:space="preserve">报告日期：2026-10-05</w:t>
       </w:r>
     </w:p>
     <w:p>
@@ -78,7 +78,7 @@
           <w:b/>
           <w:bCs/>
         </w:rPr>
-        <w:t xml:space="preserve">M1 纵向切片本机可运行、协议闭环本机实测通过；纯托管侧评审项全部收口；已 git 化（3 提交）；真机项待验</w:t>
+        <w:t xml:space="preserve">M1 纵向切片本机可运行、协议闭环本机实测通过；纯托管侧全部收口；已 git 化（15 提交、71 测试）；真机项待验</w:t>
       </w:r>
     </w:p>
     <w:p>
@@ -125,6 +125,18 @@
         </w:rPr>
         <w:t xml:space="preserve">schema/songlink-frame.schema.json</w:t>
       </w:r>
+      <w:r>
+        <w:rPr>
+          <w:rFonts w:ascii="Arial" w:eastAsia="Microsoft YaHei"/>
+        </w:rPr>
+        <w:t xml:space="preserve">、</w:t>
+      </w:r>
+      <w:r>
+        <w:rPr>
+          <w:rFonts w:ascii="Consolas" w:cs="Consolas" w:eastAsia="Consolas" w:hAnsi="Consolas"/>
+        </w:rPr>
+        <w:t xml:space="preserve">M2-点歌校准手册.md</w:t>
+      </w:r>
     </w:p>
     <w:p>
       <w:pPr>
@@ -170,7 +182,7 @@
         <w:rPr>
           <w:rFonts w:ascii="Arial" w:eastAsia="Microsoft YaHei"/>
         </w:rPr>
-        <w:t xml:space="preserve">。Windows Host 中枢（协议库 + WebSocket 服务器 + Media Bus + 适配器抽象 + 鉴权 + 歌词 + 封面 + 音源模式 + 断线补发 + 组合根配置化 + 音频串流接收）在本机编译并端到端跑通；安卓遥控端与真实 SMTC 适配器作为源码交付（受本机环境限制无法编译，见 §6）。</w:t>
+        <w:t xml:space="preserve">。Windows Host 中枢（协议库 + WebSocket 服务器 + Media Bus + 适配器抽象 + 鉴权 + 歌词 + 封面 + 音源模式 + 断线补发 + 组合根配置化 + 音频串流接收 + 队列 + 本地音源导入 + HMAC 签名）在本机编译并端到端跑通；安卓遥控端与真实 SMTC/OCR 适配器作为源码交付（受本机环境限制无法编译，见 §6）。</w:t>
       </w:r>
     </w:p>
     <w:p>
@@ -190,13 +202,25 @@
           <w:b/>
           <w:bCs/>
         </w:rPr>
-        <w:t xml:space="preserve">其中全部纯托管可本机验证的 13 项（#1–#12 + 契约 §7）已修复并加测试锁死</w:t>
-      </w:r>
-      <w:r>
-        <w:rPr>
-          <w:rFonts w:ascii="Arial" w:eastAsia="Microsoft YaHei"/>
-        </w:rPr>
-        <w:t xml:space="preserve">。过程中还抓出并修复了 5 个真实缺陷（多为"同机自测掩盖"的跨栈/局域网问题）。</w:t>
+        <w:t xml:space="preserve">全部纯托管可本机验证的 13 项（#1–#12 + 契约 §7）已修复并加测试锁死</w:t>
+      </w:r>
+      <w:r>
+        <w:rPr>
+          <w:rFonts w:ascii="Arial" w:eastAsia="Microsoft YaHei"/>
+        </w:rPr>
+        <w:t xml:space="preserve">。过程中还抓出并修复了多个真实缺陷（多为"同机自测掩盖"的跨栈/局域网问题，含一处 </w:t>
+      </w:r>
+      <w:r>
+        <w:rPr>
+          <w:rFonts w:ascii="Consolas" w:cs="Consolas" w:eastAsia="Consolas" w:hAnsi="Consolas"/>
+        </w:rPr>
+        <w:t xml:space="preserve">DisposeAsync</w:t>
+      </w:r>
+      <w:r>
+        <w:rPr>
+          <w:rFonts w:ascii="Arial" w:eastAsia="Microsoft YaHei"/>
+        </w:rPr>
+        <w:t xml:space="preserve"> 会挂死 CI 的阻塞）。</w:t>
       </w:r>
     </w:p>
     <w:p>
@@ -208,7 +232,7 @@
         <w:rPr>
           <w:rFonts w:ascii="Arial" w:eastAsia="Microsoft YaHei"/>
         </w:rPr>
-        <w:t xml:space="preserve">随后两轮产品化：</w:t>
+        <w:t xml:space="preserve">三轮产品化/加固：① </w:t>
       </w:r>
       <w:r>
         <w:rPr>
@@ -222,31 +246,7 @@
         <w:rPr>
           <w:rFonts w:ascii="Arial" w:eastAsia="Microsoft YaHei"/>
         </w:rPr>
-        <w:t xml:space="preserve">（</w:t>
-      </w:r>
-      <w:r>
-        <w:rPr>
-          <w:rFonts w:ascii="Consolas" w:cs="Consolas" w:eastAsia="Consolas" w:hAnsi="Consolas"/>
-        </w:rPr>
-        <w:t xml:space="preserve">HostConfig</w:t>
-      </w:r>
-      <w:r>
-        <w:rPr>
-          <w:rFonts w:ascii="Arial" w:eastAsia="Microsoft YaHei"/>
-        </w:rPr>
         <w:t xml:space="preserve"> + </w:t>
-      </w:r>
-      <w:r>
-        <w:rPr>
-          <w:rFonts w:ascii="Consolas" w:cs="Consolas" w:eastAsia="Consolas" w:hAnsi="Consolas"/>
-        </w:rPr>
-        <w:t xml:space="preserve">AdapterFactory</w:t>
-      </w:r>
-      <w:r>
-        <w:rPr>
-          <w:rFonts w:ascii="Arial" w:eastAsia="Microsoft YaHei"/>
-        </w:rPr>
-        <w:t xml:space="preserve">，内置 fake、外部 SMTC 反射按配置加载，Host.Core 不硬依赖 WinRT）与 </w:t>
       </w:r>
       <w:r>
         <w:rPr>
@@ -254,25 +254,107 @@
           <w:b/>
           <w:bCs/>
         </w:rPr>
-        <w:t xml:space="preserve">音频串流并入 Host</w:t>
-      </w:r>
-      <w:r>
-        <w:rPr>
-          <w:rFonts w:ascii="Arial" w:eastAsia="Microsoft YaHei"/>
-        </w:rPr>
-        <w:t xml:space="preserve">（</w:t>
-      </w:r>
-      <w:r>
-        <w:rPr>
-          <w:rFonts w:ascii="Consolas" w:cs="Consolas" w:eastAsia="Consolas" w:hAnsi="Consolas"/>
-        </w:rPr>
-        <w:t xml:space="preserve">SongLink.Host.AudioStream</w:t>
-      </w:r>
-      <w:r>
-        <w:rPr>
-          <w:rFonts w:ascii="Arial" w:eastAsia="Microsoft YaHei"/>
-        </w:rPr>
-        <w:t xml:space="preserve">：UDP→Concentus 解 Opus→可注入渲染器，NullRenderer 使解码回路本机可测）。项目已 </w:t>
+        <w:t xml:space="preserve">音频串流并入</w:t>
+      </w:r>
+      <w:r>
+        <w:rPr>
+          <w:rFonts w:ascii="Arial" w:eastAsia="Microsoft YaHei"/>
+        </w:rPr>
+        <w:t xml:space="preserve">；② </w:t>
+      </w:r>
+      <w:r>
+        <w:rPr>
+          <w:rFonts w:ascii="Arial" w:eastAsia="Microsoft YaHei"/>
+          <w:b/>
+          <w:bCs/>
+        </w:rPr>
+        <w:t xml:space="preserve">HMAC 每帧签名</w:t>
+      </w:r>
+      <w:r>
+        <w:rPr>
+          <w:rFonts w:ascii="Arial" w:eastAsia="Microsoft YaHei"/>
+        </w:rPr>
+        <w:t xml:space="preserve">（入站 token 验签 + 出站 hostKey 签名 + </w:t>
+      </w:r>
+      <w:r>
+        <w:rPr>
+          <w:rFonts w:ascii="Consolas" w:cs="Consolas" w:eastAsia="Consolas" w:hAnsi="Consolas"/>
+        </w:rPr>
+        <w:t xml:space="preserve">sig-smoke.sh</w:t>
+      </w:r>
+      <w:r>
+        <w:rPr>
+          <w:rFonts w:ascii="Arial" w:eastAsia="Microsoft YaHei"/>
+        </w:rPr>
+        <w:t xml:space="preserve"> 端到端联调）+ </w:t>
+      </w:r>
+      <w:r>
+        <w:rPr>
+          <w:rFonts w:ascii="Consolas" w:cs="Consolas" w:eastAsia="Consolas" w:hAnsi="Consolas"/>
+        </w:rPr>
+        <w:t xml:space="preserve">.editorconfig</w:t>
+      </w:r>
+      <w:r>
+        <w:rPr>
+          <w:rFonts w:ascii="Arial" w:eastAsia="Microsoft YaHei"/>
+        </w:rPr>
+        <w:t xml:space="preserve">/分析器 + CI；③ *</w:t>
+      </w:r>
+      <w:r>
+        <w:rPr>
+          <w:rFonts w:ascii="Arial" w:eastAsia="Microsoft YaHei"/>
+          <w:i/>
+          <w:iCs/>
+        </w:rPr>
+        <w:t xml:space="preserve">queue.\</w:t>
+      </w:r>
+      <w:r>
+        <w:rPr>
+          <w:rFonts w:ascii="Arial" w:eastAsia="Microsoft YaHei"/>
+        </w:rPr>
+        <w:t xml:space="preserve"> 点歌队列</w:t>
+      </w:r>
+      <w:r>
+        <w:rPr>
+          <w:rFonts w:ascii="Arial" w:eastAsia="Microsoft YaHei"/>
+          <w:b/>
+          <w:bCs/>
+        </w:rPr>
+        <w:t xml:space="preserve"> + </w:t>
+      </w:r>
+      <w:r>
+        <w:rPr>
+          <w:rFonts w:ascii="Arial" w:eastAsia="Microsoft YaHei"/>
+        </w:rPr>
+        <w:t xml:space="preserve">import 本地音源库</w:t>
+      </w:r>
+      <w:r>
+        <w:rPr>
+          <w:rFonts w:ascii="Arial" w:eastAsia="Microsoft YaHei"/>
+          <w:b/>
+          <w:bCs/>
+        </w:rPr>
+        <w:t xml:space="preserve">（HTTP `POST /import`）+ </w:t>
+      </w:r>
+      <w:r>
+        <w:rPr>
+          <w:rFonts w:ascii="Arial" w:eastAsia="Microsoft YaHei"/>
+        </w:rPr>
+        <w:t xml:space="preserve">UiaProbe</w:t>
+      </w:r>
+      <w:r>
+        <w:rPr>
+          <w:rFonts w:ascii="Arial" w:eastAsia="Microsoft YaHei"/>
+          <w:b/>
+          <w:bCs/>
+        </w:rPr>
+        <w:t xml:space="preserve"> UIA 探测工具与 </w:t>
+      </w:r>
+      <w:r>
+        <w:rPr>
+          <w:rFonts w:ascii="Arial" w:eastAsia="Microsoft YaHei"/>
+        </w:rPr>
+        <w:t xml:space="preserve">M2 点歌校准手册**。项目已 </w:t>
       </w:r>
       <w:r>
         <w:rPr>
@@ -284,7 +366,7 @@
         <w:rPr>
           <w:rFonts w:ascii="Arial" w:eastAsia="Microsoft YaHei"/>
         </w:rPr>
-        <w:t xml:space="preserve"> 并累计 3 次提交。</w:t>
+        <w:t xml:space="preserve"> 并累计 15 次提交。</w:t>
       </w:r>
     </w:p>
     <w:p>
@@ -316,7 +398,7 @@
           <w:b/>
           <w:bCs/>
         </w:rPr>
-        <w:t xml:space="preserve">47/47 通过</w:t>
+        <w:t xml:space="preserve">71/71 通过</w:t>
       </w:r>
       <w:r>
         <w:rPr>
@@ -336,7 +418,19 @@
         <w:rPr>
           <w:rFonts w:ascii="Arial" w:eastAsia="Microsoft YaHei"/>
         </w:rPr>
-        <w:t xml:space="preserve">；六个纯托管工程（Protocol / Host.Core / Host.AudioStream / RemoteSim / Protocol.Tests，加需开发机的 Smtc）编译 </w:t>
+        <w:t xml:space="preserve">；</w:t>
+      </w:r>
+      <w:r>
+        <w:rPr>
+          <w:rFonts w:ascii="Consolas" w:cs="Consolas" w:eastAsia="Consolas" w:hAnsi="Consolas"/>
+        </w:rPr>
+        <w:t xml:space="preserve">sig-smoke.sh</w:t>
+      </w:r>
+      <w:r>
+        <w:rPr>
+          <w:rFonts w:ascii="Arial" w:eastAsia="Microsoft YaHei"/>
+        </w:rPr>
+        <w:t xml:space="preserve"> 端到端签名联调 ✅；9 个工程（含 WinRT/工具）除两个 WinRT 工程因缺投影 pack 报环境性 CS1061 外，均 </w:t>
       </w:r>
       <w:r>
         <w:rPr>
@@ -350,7 +444,7 @@
         <w:rPr>
           <w:rFonts w:ascii="Arial" w:eastAsia="Microsoft YaHei"/>
         </w:rPr>
-        <w:t xml:space="preserve">（Smtc 仅环境性 CS1061）。</w:t>
+        <w:t xml:space="preserve">。</w:t>
       </w:r>
     </w:p>
     <w:p>
@@ -946,7 +1040,7 @@
               <w:rPr>
                 <w:rFonts w:ascii="Arial" w:eastAsia="Microsoft YaHei"/>
               </w:rPr>
-              <w:t xml:space="preserve">WebSocket 服务器 + Media Bus + 鉴权 + 歌词 + 封面 + 重放 + 组合根 + 音频 sink 接入</w:t>
+              <w:t xml:space="preserve">WebSocket 服务器 + Media Bus + 鉴权 + 歌词 + 封面 + 重放 + 组合根 + 音频 sink + 队列 + 本地库 + HMAC</w:t>
             </w:r>
           </w:p>
         </w:tc>
@@ -1124,7 +1218,31 @@
               <w:rPr>
                 <w:rFonts w:ascii="Arial" w:eastAsia="Microsoft YaHei"/>
               </w:rPr>
-              <w:t xml:space="preserve">命令行扮演手机端，集成测试/手动验证台</w:t>
+              <w:t xml:space="preserve">命令行扮演手机端（pick/search/calibrate/queue + </w:t>
+            </w:r>
+            <w:r>
+              <w:rPr>
+                <w:rFonts w:ascii="Consolas" w:cs="Consolas" w:eastAsia="Consolas" w:hAnsi="Consolas"/>
+              </w:rPr>
+              <w:t xml:space="preserve">--sign</w:t>
+            </w:r>
+            <w:r>
+              <w:rPr>
+                <w:rFonts w:ascii="Arial" w:eastAsia="Microsoft YaHei"/>
+              </w:rPr>
+              <w:t xml:space="preserve">/</w:t>
+            </w:r>
+            <w:r>
+              <w:rPr>
+                <w:rFonts w:ascii="Consolas" w:cs="Consolas" w:eastAsia="Consolas" w:hAnsi="Consolas"/>
+              </w:rPr>
+              <w:t xml:space="preserve">--verify</w:t>
+            </w:r>
+            <w:r>
+              <w:rPr>
+                <w:rFonts w:ascii="Arial" w:eastAsia="Microsoft YaHei"/>
+              </w:rPr>
+              <w:t xml:space="preserve">）</w:t>
             </w:r>
           </w:p>
         </w:tc>
@@ -1201,7 +1319,7 @@
               <w:rPr>
                 <w:rFonts w:ascii="Arial" w:eastAsia="Microsoft YaHei"/>
               </w:rPr>
-              <w:t xml:space="preserve">xUnit + JsonSchema.Net，47 用例（含组合根 + 音频回路）</w:t>
+              <w:t xml:space="preserve">xUnit + JsonSchema.Net，71 用例（含组合根/音频/HMAC/队列/导入/OCR）</w:t>
             </w:r>
           </w:p>
         </w:tc>
@@ -1228,7 +1346,7 @@
               <w:rPr>
                 <w:rFonts w:ascii="Arial" w:eastAsia="Microsoft YaHei"/>
               </w:rPr>
-              <w:t xml:space="preserve">SMTC 适配器</w:t>
+              <w:t xml:space="preserve">M2 点歌框架</w:t>
             </w:r>
           </w:p>
         </w:tc>
@@ -1253,7 +1371,7 @@
               <w:rPr>
                 <w:rFonts w:ascii="Consolas" w:cs="Consolas" w:eastAsia="Consolas" w:hAnsi="Consolas"/>
               </w:rPr>
-              <w:t xml:space="preserve">src/SongLink.Host.Adapters.Smtc/</w:t>
+              <w:t xml:space="preserve">src/SongLink.Host.Adapters.UiaPick/</w:t>
             </w:r>
           </w:p>
         </w:tc>
@@ -1278,7 +1396,19 @@
               <w:rPr>
                 <w:rFonts w:ascii="Arial" w:eastAsia="Microsoft YaHei"/>
               </w:rPr>
-              <w:t xml:space="preserve">真实 SMTC（WinRT，源码/开发机编译）</w:t>
+              <w:t xml:space="preserve">包 inner(SMTC) + UIA 点歌 + OCR 兜底；</w:t>
+            </w:r>
+            <w:r>
+              <w:rPr>
+                <w:rFonts w:ascii="Consolas" w:cs="Consolas" w:eastAsia="Consolas" w:hAnsi="Consolas"/>
+              </w:rPr>
+              <w:t xml:space="preserve">AppDescriptor</w:t>
+            </w:r>
+            <w:r>
+              <w:rPr>
+                <w:rFonts w:ascii="Arial" w:eastAsia="Microsoft YaHei"/>
+              </w:rPr>
+              <w:t xml:space="preserve"> 数据驱动</w:t>
             </w:r>
           </w:p>
         </w:tc>
@@ -1305,7 +1435,7 @@
               <w:rPr>
                 <w:rFonts w:ascii="Arial" w:eastAsia="Microsoft YaHei"/>
               </w:rPr>
-              <w:t xml:space="preserve">Spike：SMTC 探针</w:t>
+              <w:t xml:space="preserve">OCR 引擎</w:t>
             </w:r>
           </w:p>
         </w:tc>
@@ -1330,7 +1460,7 @@
               <w:rPr>
                 <w:rFonts w:ascii="Consolas" w:cs="Consolas" w:eastAsia="Consolas" w:hAnsi="Consolas"/>
               </w:rPr>
-              <w:t xml:space="preserve">spike/smtc-probe/</w:t>
+              <w:t xml:space="preserve">src/SongLink.Host.Adapters.Ocr/</w:t>
             </w:r>
           </w:p>
         </w:tc>
@@ -1353,9 +1483,15 @@
           <w:p>
             <w:r>
               <w:rPr>
-                <w:rFonts w:ascii="Arial" w:eastAsia="Microsoft YaHei"/>
-              </w:rPr>
-              <w:t xml:space="preserve">跨 App 读元数据/封面/进度/控制 + dump</w:t>
+                <w:rFonts w:ascii="Consolas" w:cs="Consolas" w:eastAsia="Consolas" w:hAnsi="Consolas"/>
+              </w:rPr>
+              <w:t xml:space="preserve">MediaOcrEngine</w:t>
+            </w:r>
+            <w:r>
+              <w:rPr>
+                <w:rFonts w:ascii="Arial" w:eastAsia="Microsoft YaHei"/>
+              </w:rPr>
+              <w:t xml:space="preserve">（Windows.Media.Ocr，WinRT/开发机）</w:t>
             </w:r>
           </w:p>
         </w:tc>
@@ -1382,7 +1518,7 @@
               <w:rPr>
                 <w:rFonts w:ascii="Arial" w:eastAsia="Microsoft YaHei"/>
               </w:rPr>
-              <w:t xml:space="preserve">Spike：能力矩阵</w:t>
+              <w:t xml:space="preserve">SMTC 适配器</w:t>
             </w:r>
           </w:p>
         </w:tc>
@@ -1407,7 +1543,7 @@
               <w:rPr>
                 <w:rFonts w:ascii="Consolas" w:cs="Consolas" w:eastAsia="Consolas" w:hAnsi="Consolas"/>
               </w:rPr>
-              <w:t xml:space="preserve">spike/smtc-matrix/</w:t>
+              <w:t xml:space="preserve">src/SongLink.Host.Adapters.Smtc/</w:t>
             </w:r>
           </w:p>
         </w:tc>
@@ -1432,7 +1568,7 @@
               <w:rPr>
                 <w:rFonts w:ascii="Arial" w:eastAsia="Microsoft YaHei"/>
               </w:rPr>
-              <w:t xml:space="preserve">纯托管，JSON→矩阵表+CSV（本机跑通）</w:t>
+              <w:t xml:space="preserve">真实 SMTC（WinRT，源码/开发机编译）</w:t>
             </w:r>
           </w:p>
         </w:tc>
@@ -1459,7 +1595,7 @@
               <w:rPr>
                 <w:rFonts w:ascii="Arial" w:eastAsia="Microsoft YaHei"/>
               </w:rPr>
-              <w:t xml:space="preserve">Spike：音频串流</w:t>
+              <w:t xml:space="preserve">UIA 探测工具</w:t>
             </w:r>
           </w:p>
         </w:tc>
@@ -1484,7 +1620,7 @@
               <w:rPr>
                 <w:rFonts w:ascii="Consolas" w:cs="Consolas" w:eastAsia="Consolas" w:hAnsi="Consolas"/>
               </w:rPr>
-              <w:t xml:space="preserve">spike/audio-stream/</w:t>
+              <w:t xml:space="preserve">src/SongLink.Tools.UiaProbe/</w:t>
             </w:r>
           </w:p>
         </w:tc>
@@ -1507,9 +1643,27 @@
           <w:p>
             <w:r>
               <w:rPr>
-                <w:rFonts w:ascii="Arial" w:eastAsia="Microsoft YaHei"/>
-              </w:rPr>
-              <w:t xml:space="preserve">PC 接收端（编译+selftest 过）/ 安卓采集源码</w:t>
+                <w:rFonts w:ascii="Consolas" w:cs="Consolas" w:eastAsia="Consolas" w:hAnsi="Consolas"/>
+              </w:rPr>
+              <w:t xml:space="preserve">list</w:t>
+            </w:r>
+            <w:r>
+              <w:rPr>
+                <w:rFonts w:ascii="Arial" w:eastAsia="Microsoft YaHei"/>
+              </w:rPr>
+              <w:t xml:space="preserve">/</w:t>
+            </w:r>
+            <w:r>
+              <w:rPr>
+                <w:rFonts w:ascii="Consolas" w:cs="Consolas" w:eastAsia="Consolas" w:hAnsi="Consolas"/>
+              </w:rPr>
+              <w:t xml:space="preserve">dump</w:t>
+            </w:r>
+            <w:r>
+              <w:rPr>
+                <w:rFonts w:ascii="Arial" w:eastAsia="Microsoft YaHei"/>
+              </w:rPr>
+              <w:t xml:space="preserve"> 打印窗口 UIA 树，辅助写 AppDescriptor</w:t>
             </w:r>
           </w:p>
         </w:tc>
@@ -1536,7 +1690,7 @@
               <w:rPr>
                 <w:rFonts w:ascii="Arial" w:eastAsia="Microsoft YaHei"/>
               </w:rPr>
-              <w:t xml:space="preserve">安卓遥控端</w:t>
+              <w:t xml:space="preserve">Spike：SMTC 探针</w:t>
             </w:r>
           </w:p>
         </w:tc>
@@ -1561,7 +1715,7 @@
               <w:rPr>
                 <w:rFonts w:ascii="Consolas" w:cs="Consolas" w:eastAsia="Consolas" w:hAnsi="Consolas"/>
               </w:rPr>
-              <w:t xml:space="preserve">remote/</w:t>
+              <w:t xml:space="preserve">spike/smtc-probe/</w:t>
             </w:r>
           </w:p>
         </w:tc>
@@ -1586,7 +1740,7 @@
               <w:rPr>
                 <w:rFonts w:ascii="Arial" w:eastAsia="Microsoft YaHei"/>
               </w:rPr>
-              <w:t xml:space="preserve">协议镜像 + WS 客户端 + 副屏 Compose（源码）</w:t>
+              <w:t xml:space="preserve">跨 App 读元数据/封面/进度/控制 + dump</w:t>
             </w:r>
           </w:p>
         </w:tc>
@@ -1613,6 +1767,326 @@
               <w:rPr>
                 <w:rFonts w:ascii="Arial" w:eastAsia="Microsoft YaHei"/>
               </w:rPr>
+              <w:t xml:space="preserve">Spike：能力矩阵</w:t>
+            </w:r>
+          </w:p>
+        </w:tc>
+        <w:tc>
+          <w:tcPr>
+            <w:tcW w:type="dxa" w:w="3008"/>
+            <w:tcBorders>
+              <w:top w:val="single" w:color="CCCCCC" w:sz="1"/>
+              <w:left w:val="single" w:color="CCCCCC" w:sz="1"/>
+              <w:bottom w:val="single" w:color="CCCCCC" w:sz="1"/>
+              <w:right w:val="single" w:color="CCCCCC" w:sz="1"/>
+            </w:tcBorders>
+            <w:tcMar>
+              <w:top w:type="dxa" w:w="80"/>
+              <w:left w:type="dxa" w:w="120"/>
+              <w:bottom w:type="dxa" w:w="80"/>
+              <w:right w:type="dxa" w:w="120"/>
+            </w:tcMar>
+          </w:tcPr>
+          <w:p>
+            <w:r>
+              <w:rPr>
+                <w:rFonts w:ascii="Consolas" w:cs="Consolas" w:eastAsia="Consolas" w:hAnsi="Consolas"/>
+              </w:rPr>
+              <w:t xml:space="preserve">spike/smtc-matrix/</w:t>
+            </w:r>
+          </w:p>
+        </w:tc>
+        <w:tc>
+          <w:tcPr>
+            <w:tcW w:type="dxa" w:w="3008"/>
+            <w:tcBorders>
+              <w:top w:val="single" w:color="CCCCCC" w:sz="1"/>
+              <w:left w:val="single" w:color="CCCCCC" w:sz="1"/>
+              <w:bottom w:val="single" w:color="CCCCCC" w:sz="1"/>
+              <w:right w:val="single" w:color="CCCCCC" w:sz="1"/>
+            </w:tcBorders>
+            <w:tcMar>
+              <w:top w:type="dxa" w:w="80"/>
+              <w:left w:type="dxa" w:w="120"/>
+              <w:bottom w:type="dxa" w:w="80"/>
+              <w:right w:type="dxa" w:w="120"/>
+            </w:tcMar>
+          </w:tcPr>
+          <w:p>
+            <w:r>
+              <w:rPr>
+                <w:rFonts w:ascii="Arial" w:eastAsia="Microsoft YaHei"/>
+              </w:rPr>
+              <w:t xml:space="preserve">纯托管，JSON→矩阵表+CSV（本机跑通）</w:t>
+            </w:r>
+          </w:p>
+        </w:tc>
+      </w:tr>
+      <w:tr>
+        <w:tc>
+          <w:tcPr>
+            <w:tcW w:type="dxa" w:w="3008"/>
+            <w:tcBorders>
+              <w:top w:val="single" w:color="CCCCCC" w:sz="1"/>
+              <w:left w:val="single" w:color="CCCCCC" w:sz="1"/>
+              <w:bottom w:val="single" w:color="CCCCCC" w:sz="1"/>
+              <w:right w:val="single" w:color="CCCCCC" w:sz="1"/>
+            </w:tcBorders>
+            <w:tcMar>
+              <w:top w:type="dxa" w:w="80"/>
+              <w:left w:type="dxa" w:w="120"/>
+              <w:bottom w:type="dxa" w:w="80"/>
+              <w:right w:type="dxa" w:w="120"/>
+            </w:tcMar>
+          </w:tcPr>
+          <w:p>
+            <w:r>
+              <w:rPr>
+                <w:rFonts w:ascii="Arial" w:eastAsia="Microsoft YaHei"/>
+              </w:rPr>
+              <w:t xml:space="preserve">Spike：音频串流</w:t>
+            </w:r>
+          </w:p>
+        </w:tc>
+        <w:tc>
+          <w:tcPr>
+            <w:tcW w:type="dxa" w:w="3008"/>
+            <w:tcBorders>
+              <w:top w:val="single" w:color="CCCCCC" w:sz="1"/>
+              <w:left w:val="single" w:color="CCCCCC" w:sz="1"/>
+              <w:bottom w:val="single" w:color="CCCCCC" w:sz="1"/>
+              <w:right w:val="single" w:color="CCCCCC" w:sz="1"/>
+            </w:tcBorders>
+            <w:tcMar>
+              <w:top w:type="dxa" w:w="80"/>
+              <w:left w:type="dxa" w:w="120"/>
+              <w:bottom w:type="dxa" w:w="80"/>
+              <w:right w:type="dxa" w:w="120"/>
+            </w:tcMar>
+          </w:tcPr>
+          <w:p>
+            <w:r>
+              <w:rPr>
+                <w:rFonts w:ascii="Consolas" w:cs="Consolas" w:eastAsia="Consolas" w:hAnsi="Consolas"/>
+              </w:rPr>
+              <w:t xml:space="preserve">spike/audio-stream/</w:t>
+            </w:r>
+          </w:p>
+        </w:tc>
+        <w:tc>
+          <w:tcPr>
+            <w:tcW w:type="dxa" w:w="3008"/>
+            <w:tcBorders>
+              <w:top w:val="single" w:color="CCCCCC" w:sz="1"/>
+              <w:left w:val="single" w:color="CCCCCC" w:sz="1"/>
+              <w:bottom w:val="single" w:color="CCCCCC" w:sz="1"/>
+              <w:right w:val="single" w:color="CCCCCC" w:sz="1"/>
+            </w:tcBorders>
+            <w:tcMar>
+              <w:top w:type="dxa" w:w="80"/>
+              <w:left w:type="dxa" w:w="120"/>
+              <w:bottom w:type="dxa" w:w="80"/>
+              <w:right w:type="dxa" w:w="120"/>
+            </w:tcMar>
+          </w:tcPr>
+          <w:p>
+            <w:r>
+              <w:rPr>
+                <w:rFonts w:ascii="Arial" w:eastAsia="Microsoft YaHei"/>
+              </w:rPr>
+              <w:t xml:space="preserve">PC 接收端（编译+selftest 过）/ 安卓采集源码</w:t>
+            </w:r>
+          </w:p>
+        </w:tc>
+      </w:tr>
+      <w:tr>
+        <w:tc>
+          <w:tcPr>
+            <w:tcW w:type="dxa" w:w="3008"/>
+            <w:tcBorders>
+              <w:top w:val="single" w:color="CCCCCC" w:sz="1"/>
+              <w:left w:val="single" w:color="CCCCCC" w:sz="1"/>
+              <w:bottom w:val="single" w:color="CCCCCC" w:sz="1"/>
+              <w:right w:val="single" w:color="CCCCCC" w:sz="1"/>
+            </w:tcBorders>
+            <w:tcMar>
+              <w:top w:type="dxa" w:w="80"/>
+              <w:left w:type="dxa" w:w="120"/>
+              <w:bottom w:type="dxa" w:w="80"/>
+              <w:right w:type="dxa" w:w="120"/>
+            </w:tcMar>
+          </w:tcPr>
+          <w:p>
+            <w:r>
+              <w:rPr>
+                <w:rFonts w:ascii="Arial" w:eastAsia="Microsoft YaHei"/>
+              </w:rPr>
+              <w:t xml:space="preserve">安卓遥控端</w:t>
+            </w:r>
+          </w:p>
+        </w:tc>
+        <w:tc>
+          <w:tcPr>
+            <w:tcW w:type="dxa" w:w="3008"/>
+            <w:tcBorders>
+              <w:top w:val="single" w:color="CCCCCC" w:sz="1"/>
+              <w:left w:val="single" w:color="CCCCCC" w:sz="1"/>
+              <w:bottom w:val="single" w:color="CCCCCC" w:sz="1"/>
+              <w:right w:val="single" w:color="CCCCCC" w:sz="1"/>
+            </w:tcBorders>
+            <w:tcMar>
+              <w:top w:type="dxa" w:w="80"/>
+              <w:left w:type="dxa" w:w="120"/>
+              <w:bottom w:type="dxa" w:w="80"/>
+              <w:right w:type="dxa" w:w="120"/>
+            </w:tcMar>
+          </w:tcPr>
+          <w:p>
+            <w:r>
+              <w:rPr>
+                <w:rFonts w:ascii="Consolas" w:cs="Consolas" w:eastAsia="Consolas" w:hAnsi="Consolas"/>
+              </w:rPr>
+              <w:t xml:space="preserve">remote/</w:t>
+            </w:r>
+          </w:p>
+        </w:tc>
+        <w:tc>
+          <w:tcPr>
+            <w:tcW w:type="dxa" w:w="3008"/>
+            <w:tcBorders>
+              <w:top w:val="single" w:color="CCCCCC" w:sz="1"/>
+              <w:left w:val="single" w:color="CCCCCC" w:sz="1"/>
+              <w:bottom w:val="single" w:color="CCCCCC" w:sz="1"/>
+              <w:right w:val="single" w:color="CCCCCC" w:sz="1"/>
+            </w:tcBorders>
+            <w:tcMar>
+              <w:top w:type="dxa" w:w="80"/>
+              <w:left w:type="dxa" w:w="120"/>
+              <w:bottom w:type="dxa" w:w="80"/>
+              <w:right w:type="dxa" w:w="120"/>
+            </w:tcMar>
+          </w:tcPr>
+          <w:p>
+            <w:r>
+              <w:rPr>
+                <w:rFonts w:ascii="Arial" w:eastAsia="Microsoft YaHei"/>
+              </w:rPr>
+              <w:t xml:space="preserve">协议镜像 + WS 客户端 + 副屏 Compose（源码）</w:t>
+            </w:r>
+          </w:p>
+        </w:tc>
+      </w:tr>
+      <w:tr>
+        <w:tc>
+          <w:tcPr>
+            <w:tcW w:type="dxa" w:w="3008"/>
+            <w:tcBorders>
+              <w:top w:val="single" w:color="CCCCCC" w:sz="1"/>
+              <w:left w:val="single" w:color="CCCCCC" w:sz="1"/>
+              <w:bottom w:val="single" w:color="CCCCCC" w:sz="1"/>
+              <w:right w:val="single" w:color="CCCCCC" w:sz="1"/>
+            </w:tcBorders>
+            <w:tcMar>
+              <w:top w:type="dxa" w:w="80"/>
+              <w:left w:type="dxa" w:w="120"/>
+              <w:bottom w:type="dxa" w:w="80"/>
+              <w:right w:type="dxa" w:w="120"/>
+            </w:tcMar>
+          </w:tcPr>
+          <w:p>
+            <w:r>
+              <w:rPr>
+                <w:rFonts w:ascii="Arial" w:eastAsia="Microsoft YaHei"/>
+              </w:rPr>
+              <w:t xml:space="preserve">脚本 / 手册</w:t>
+            </w:r>
+          </w:p>
+        </w:tc>
+        <w:tc>
+          <w:tcPr>
+            <w:tcW w:type="dxa" w:w="3008"/>
+            <w:tcBorders>
+              <w:top w:val="single" w:color="CCCCCC" w:sz="1"/>
+              <w:left w:val="single" w:color="CCCCCC" w:sz="1"/>
+              <w:bottom w:val="single" w:color="CCCCCC" w:sz="1"/>
+              <w:right w:val="single" w:color="CCCCCC" w:sz="1"/>
+            </w:tcBorders>
+            <w:tcMar>
+              <w:top w:type="dxa" w:w="80"/>
+              <w:left w:type="dxa" w:w="120"/>
+              <w:bottom w:type="dxa" w:w="80"/>
+              <w:right w:type="dxa" w:w="120"/>
+            </w:tcMar>
+          </w:tcPr>
+          <w:p>
+            <w:r>
+              <w:rPr>
+                <w:rFonts w:ascii="Consolas" w:cs="Consolas" w:eastAsia="Consolas" w:hAnsi="Consolas"/>
+              </w:rPr>
+              <w:t xml:space="preserve">scripts/sig-smoke.sh</w:t>
+            </w:r>
+            <w:r>
+              <w:rPr>
+                <w:rFonts w:ascii="Arial" w:eastAsia="Microsoft YaHei"/>
+              </w:rPr>
+              <w:t xml:space="preserve"> · </w:t>
+            </w:r>
+            <w:r>
+              <w:rPr>
+                <w:rFonts w:ascii="Consolas" w:cs="Consolas" w:eastAsia="Consolas" w:hAnsi="Consolas"/>
+              </w:rPr>
+              <w:t xml:space="preserve">docs/M2-点歌校准手册.md</w:t>
+            </w:r>
+          </w:p>
+        </w:tc>
+        <w:tc>
+          <w:tcPr>
+            <w:tcW w:type="dxa" w:w="3008"/>
+            <w:tcBorders>
+              <w:top w:val="single" w:color="CCCCCC" w:sz="1"/>
+              <w:left w:val="single" w:color="CCCCCC" w:sz="1"/>
+              <w:bottom w:val="single" w:color="CCCCCC" w:sz="1"/>
+              <w:right w:val="single" w:color="CCCCCC" w:sz="1"/>
+            </w:tcBorders>
+            <w:tcMar>
+              <w:top w:type="dxa" w:w="80"/>
+              <w:left w:type="dxa" w:w="120"/>
+              <w:bottom w:type="dxa" w:w="80"/>
+              <w:right w:type="dxa" w:w="120"/>
+            </w:tcMar>
+          </w:tcPr>
+          <w:p>
+            <w:r>
+              <w:rPr>
+                <w:rFonts w:ascii="Arial" w:eastAsia="Microsoft YaHei"/>
+              </w:rPr>
+              <w:t xml:space="preserve">HMAC 端到端联调；M2 逐 App 校准流程</w:t>
+            </w:r>
+          </w:p>
+        </w:tc>
+      </w:tr>
+      <w:tr>
+        <w:tc>
+          <w:tcPr>
+            <w:tcW w:type="dxa" w:w="3008"/>
+            <w:tcBorders>
+              <w:top w:val="single" w:color="CCCCCC" w:sz="1"/>
+              <w:left w:val="single" w:color="CCCCCC" w:sz="1"/>
+              <w:bottom w:val="single" w:color="CCCCCC" w:sz="1"/>
+              <w:right w:val="single" w:color="CCCCCC" w:sz="1"/>
+            </w:tcBorders>
+            <w:tcMar>
+              <w:top w:type="dxa" w:w="80"/>
+              <w:left w:type="dxa" w:w="120"/>
+              <w:bottom w:type="dxa" w:w="80"/>
+              <w:right w:type="dxa" w:w="120"/>
+            </w:tcMar>
+          </w:tcPr>
+          <w:p>
+            <w:r>
+              <w:rPr>
+                <w:rFonts w:ascii="Arial" w:eastAsia="Microsoft YaHei"/>
+              </w:rPr>
               <w:t xml:space="preserve">解决方案 / CI / 版本库</w:t>
             </w:r>
           </w:p>
@@ -1662,6 +2136,18 @@
               <w:rPr>
                 <w:rFonts w:ascii="Consolas" w:cs="Consolas" w:eastAsia="Consolas" w:hAnsi="Consolas"/>
               </w:rPr>
+              <w:t xml:space="preserve">.editorconfig</w:t>
+            </w:r>
+            <w:r>
+              <w:rPr>
+                <w:rFonts w:ascii="Arial" w:eastAsia="Microsoft YaHei"/>
+              </w:rPr>
+              <w:t xml:space="preserve"> · </w:t>
+            </w:r>
+            <w:r>
+              <w:rPr>
+                <w:rFonts w:ascii="Consolas" w:cs="Consolas" w:eastAsia="Consolas" w:hAnsi="Consolas"/>
+              </w:rPr>
               <w:t xml:space="preserve">.gitignore</w:t>
             </w:r>
             <w:r>
@@ -1693,7 +2179,7 @@
               <w:rPr>
                 <w:rFonts w:ascii="Arial" w:eastAsia="Microsoft YaHei"/>
               </w:rPr>
-              <w:t xml:space="preserve">6 工程 sln；windows-latest CI（核心必须过 + SMTC best-effort）；已 3 次提交</w:t>
+              <w:t xml:space="preserve">9 工程 sln；windows-latest CI（核心测试 + sig-smoke 联调 + WinRT best-effort）；15 次提交</w:t>
             </w:r>
           </w:p>
         </w:tc>
@@ -1722,7 +2208,7 @@
         <w:rPr>
           <w:rFonts w:ascii="Arial" w:eastAsia="Microsoft YaHei"/>
         </w:rPr>
-        <w:t xml:space="preserve">3. 组件构建 / 测试状态（本机，2026-10-04）</w:t>
+        <w:t xml:space="preserve">3. 组件构建 / 测试状态（本机，2026-10-05）</w:t>
       </w:r>
     </w:p>
     <w:tbl>
@@ -2354,7 +2840,313 @@
               <w:rPr>
                 <w:rFonts w:ascii="Arial" w:eastAsia="Microsoft YaHei"/>
               </w:rPr>
-              <w:t xml:space="preserve">✅ 47/47 通过</w:t>
+              <w:t xml:space="preserve">✅ 71/71 通过</w:t>
+            </w:r>
+          </w:p>
+        </w:tc>
+      </w:tr>
+      <w:tr>
+        <w:tc>
+          <w:tcPr>
+            <w:tcW w:type="dxa" w:w="2256"/>
+            <w:tcBorders>
+              <w:top w:val="single" w:color="CCCCCC" w:sz="1"/>
+              <w:left w:val="single" w:color="CCCCCC" w:sz="1"/>
+              <w:bottom w:val="single" w:color="CCCCCC" w:sz="1"/>
+              <w:right w:val="single" w:color="CCCCCC" w:sz="1"/>
+            </w:tcBorders>
+            <w:tcMar>
+              <w:top w:type="dxa" w:w="80"/>
+              <w:left w:type="dxa" w:w="120"/>
+              <w:bottom w:type="dxa" w:w="80"/>
+              <w:right w:type="dxa" w:w="120"/>
+            </w:tcMar>
+          </w:tcPr>
+          <w:p>
+            <w:r>
+              <w:rPr>
+                <w:rFonts w:ascii="Arial" w:eastAsia="Microsoft YaHei"/>
+              </w:rPr>
+              <w:t xml:space="preserve">SongLink.Host.Adapters.UiaPick</w:t>
+            </w:r>
+          </w:p>
+        </w:tc>
+        <w:tc>
+          <w:tcPr>
+            <w:tcW w:type="dxa" w:w="2256"/>
+            <w:tcBorders>
+              <w:top w:val="single" w:color="CCCCCC" w:sz="1"/>
+              <w:left w:val="single" w:color="CCCCCC" w:sz="1"/>
+              <w:bottom w:val="single" w:color="CCCCCC" w:sz="1"/>
+              <w:right w:val="single" w:color="CCCCCC" w:sz="1"/>
+            </w:tcBorders>
+            <w:tcMar>
+              <w:top w:type="dxa" w:w="80"/>
+              <w:left w:type="dxa" w:w="120"/>
+              <w:bottom w:type="dxa" w:w="80"/>
+              <w:right w:type="dxa" w:w="120"/>
+            </w:tcMar>
+          </w:tcPr>
+          <w:p>
+            <w:r>
+              <w:rPr>
+                <w:rFonts w:ascii="Arial" w:eastAsia="Microsoft YaHei"/>
+              </w:rPr>
+              <w:t xml:space="preserve">net8.0-windows</w:t>
+            </w:r>
+          </w:p>
+        </w:tc>
+        <w:tc>
+          <w:tcPr>
+            <w:tcW w:type="dxa" w:w="2256"/>
+            <w:tcBorders>
+              <w:top w:val="single" w:color="CCCCCC" w:sz="1"/>
+              <w:left w:val="single" w:color="CCCCCC" w:sz="1"/>
+              <w:bottom w:val="single" w:color="CCCCCC" w:sz="1"/>
+              <w:right w:val="single" w:color="CCCCCC" w:sz="1"/>
+            </w:tcBorders>
+            <w:tcMar>
+              <w:top w:type="dxa" w:w="80"/>
+              <w:left w:type="dxa" w:w="120"/>
+              <w:bottom w:type="dxa" w:w="80"/>
+              <w:right w:type="dxa" w:w="120"/>
+            </w:tcMar>
+          </w:tcPr>
+          <w:p>
+            <w:r>
+              <w:rPr>
+                <w:rFonts w:ascii="Arial" w:eastAsia="Microsoft YaHei"/>
+              </w:rPr>
+              <w:t xml:space="preserve">✅ 0 错</w:t>
+            </w:r>
+          </w:p>
+        </w:tc>
+        <w:tc>
+          <w:tcPr>
+            <w:tcW w:type="dxa" w:w="2256"/>
+            <w:tcBorders>
+              <w:top w:val="single" w:color="CCCCCC" w:sz="1"/>
+              <w:left w:val="single" w:color="CCCCCC" w:sz="1"/>
+              <w:bottom w:val="single" w:color="CCCCCC" w:sz="1"/>
+              <w:right w:val="single" w:color="CCCCCC" w:sz="1"/>
+            </w:tcBorders>
+            <w:tcMar>
+              <w:top w:type="dxa" w:w="80"/>
+              <w:left w:type="dxa" w:w="120"/>
+              <w:bottom w:type="dxa" w:w="80"/>
+              <w:right w:type="dxa" w:w="120"/>
+            </w:tcMar>
+          </w:tcPr>
+          <w:p>
+            <w:r>
+              <w:rPr>
+                <w:rFonts w:ascii="Arial" w:eastAsia="Microsoft YaHei"/>
+              </w:rPr>
+              <w:t xml:space="preserve">✅ 由 Tests 覆盖（工厂装配/优雅失败）</w:t>
+            </w:r>
+          </w:p>
+        </w:tc>
+      </w:tr>
+      <w:tr>
+        <w:tc>
+          <w:tcPr>
+            <w:tcW w:type="dxa" w:w="2256"/>
+            <w:tcBorders>
+              <w:top w:val="single" w:color="CCCCCC" w:sz="1"/>
+              <w:left w:val="single" w:color="CCCCCC" w:sz="1"/>
+              <w:bottom w:val="single" w:color="CCCCCC" w:sz="1"/>
+              <w:right w:val="single" w:color="CCCCCC" w:sz="1"/>
+            </w:tcBorders>
+            <w:tcMar>
+              <w:top w:type="dxa" w:w="80"/>
+              <w:left w:type="dxa" w:w="120"/>
+              <w:bottom w:type="dxa" w:w="80"/>
+              <w:right w:type="dxa" w:w="120"/>
+            </w:tcMar>
+          </w:tcPr>
+          <w:p>
+            <w:r>
+              <w:rPr>
+                <w:rFonts w:ascii="Arial" w:eastAsia="Microsoft YaHei"/>
+              </w:rPr>
+              <w:t xml:space="preserve">SongLink.Tools.UiaProbe</w:t>
+            </w:r>
+          </w:p>
+        </w:tc>
+        <w:tc>
+          <w:tcPr>
+            <w:tcW w:type="dxa" w:w="2256"/>
+            <w:tcBorders>
+              <w:top w:val="single" w:color="CCCCCC" w:sz="1"/>
+              <w:left w:val="single" w:color="CCCCCC" w:sz="1"/>
+              <w:bottom w:val="single" w:color="CCCCCC" w:sz="1"/>
+              <w:right w:val="single" w:color="CCCCCC" w:sz="1"/>
+            </w:tcBorders>
+            <w:tcMar>
+              <w:top w:type="dxa" w:w="80"/>
+              <w:left w:type="dxa" w:w="120"/>
+              <w:bottom w:type="dxa" w:w="80"/>
+              <w:right w:type="dxa" w:w="120"/>
+            </w:tcMar>
+          </w:tcPr>
+          <w:p>
+            <w:r>
+              <w:rPr>
+                <w:rFonts w:ascii="Arial" w:eastAsia="Microsoft YaHei"/>
+              </w:rPr>
+              <w:t xml:space="preserve">net8.0-windows</w:t>
+            </w:r>
+          </w:p>
+        </w:tc>
+        <w:tc>
+          <w:tcPr>
+            <w:tcW w:type="dxa" w:w="2256"/>
+            <w:tcBorders>
+              <w:top w:val="single" w:color="CCCCCC" w:sz="1"/>
+              <w:left w:val="single" w:color="CCCCCC" w:sz="1"/>
+              <w:bottom w:val="single" w:color="CCCCCC" w:sz="1"/>
+              <w:right w:val="single" w:color="CCCCCC" w:sz="1"/>
+            </w:tcBorders>
+            <w:tcMar>
+              <w:top w:type="dxa" w:w="80"/>
+              <w:left w:type="dxa" w:w="120"/>
+              <w:bottom w:type="dxa" w:w="80"/>
+              <w:right w:type="dxa" w:w="120"/>
+            </w:tcMar>
+          </w:tcPr>
+          <w:p>
+            <w:r>
+              <w:rPr>
+                <w:rFonts w:ascii="Arial" w:eastAsia="Microsoft YaHei"/>
+              </w:rPr>
+              <w:t xml:space="preserve">✅ 0 错</w:t>
+            </w:r>
+          </w:p>
+        </w:tc>
+        <w:tc>
+          <w:tcPr>
+            <w:tcW w:type="dxa" w:w="2256"/>
+            <w:tcBorders>
+              <w:top w:val="single" w:color="CCCCCC" w:sz="1"/>
+              <w:left w:val="single" w:color="CCCCCC" w:sz="1"/>
+              <w:bottom w:val="single" w:color="CCCCCC" w:sz="1"/>
+              <w:right w:val="single" w:color="CCCCCC" w:sz="1"/>
+            </w:tcBorders>
+            <w:tcMar>
+              <w:top w:type="dxa" w:w="80"/>
+              <w:left w:type="dxa" w:w="120"/>
+              <w:bottom w:type="dxa" w:w="80"/>
+              <w:right w:type="dxa" w:w="120"/>
+            </w:tcMar>
+          </w:tcPr>
+          <w:p>
+            <w:r>
+              <w:rPr>
+                <w:rFonts w:ascii="Arial" w:eastAsia="Microsoft YaHei"/>
+              </w:rPr>
+              <w:t xml:space="preserve">⚠ 枚举窗口需交互桌面</w:t>
+            </w:r>
+          </w:p>
+        </w:tc>
+      </w:tr>
+      <w:tr>
+        <w:tc>
+          <w:tcPr>
+            <w:tcW w:type="dxa" w:w="2256"/>
+            <w:tcBorders>
+              <w:top w:val="single" w:color="CCCCCC" w:sz="1"/>
+              <w:left w:val="single" w:color="CCCCCC" w:sz="1"/>
+              <w:bottom w:val="single" w:color="CCCCCC" w:sz="1"/>
+              <w:right w:val="single" w:color="CCCCCC" w:sz="1"/>
+            </w:tcBorders>
+            <w:tcMar>
+              <w:top w:type="dxa" w:w="80"/>
+              <w:left w:type="dxa" w:w="120"/>
+              <w:bottom w:type="dxa" w:w="80"/>
+              <w:right w:type="dxa" w:w="120"/>
+            </w:tcMar>
+          </w:tcPr>
+          <w:p>
+            <w:r>
+              <w:rPr>
+                <w:rFonts w:ascii="Arial" w:eastAsia="Microsoft YaHei"/>
+              </w:rPr>
+              <w:t xml:space="preserve">SongLink.Host.Adapters.Ocr</w:t>
+            </w:r>
+          </w:p>
+        </w:tc>
+        <w:tc>
+          <w:tcPr>
+            <w:tcW w:type="dxa" w:w="2256"/>
+            <w:tcBorders>
+              <w:top w:val="single" w:color="CCCCCC" w:sz="1"/>
+              <w:left w:val="single" w:color="CCCCCC" w:sz="1"/>
+              <w:bottom w:val="single" w:color="CCCCCC" w:sz="1"/>
+              <w:right w:val="single" w:color="CCCCCC" w:sz="1"/>
+            </w:tcBorders>
+            <w:tcMar>
+              <w:top w:type="dxa" w:w="80"/>
+              <w:left w:type="dxa" w:w="120"/>
+              <w:bottom w:type="dxa" w:w="80"/>
+              <w:right w:type="dxa" w:w="120"/>
+            </w:tcMar>
+          </w:tcPr>
+          <w:p>
+            <w:r>
+              <w:rPr>
+                <w:rFonts w:ascii="Arial" w:eastAsia="Microsoft YaHei"/>
+              </w:rPr>
+              <w:t xml:space="preserve">net8.0-windows10.0.19041</w:t>
+            </w:r>
+          </w:p>
+        </w:tc>
+        <w:tc>
+          <w:tcPr>
+            <w:tcW w:type="dxa" w:w="2256"/>
+            <w:tcBorders>
+              <w:top w:val="single" w:color="CCCCCC" w:sz="1"/>
+              <w:left w:val="single" w:color="CCCCCC" w:sz="1"/>
+              <w:bottom w:val="single" w:color="CCCCCC" w:sz="1"/>
+              <w:right w:val="single" w:color="CCCCCC" w:sz="1"/>
+            </w:tcBorders>
+            <w:tcMar>
+              <w:top w:type="dxa" w:w="80"/>
+              <w:left w:type="dxa" w:w="120"/>
+              <w:bottom w:type="dxa" w:w="80"/>
+              <w:right w:type="dxa" w:w="120"/>
+            </w:tcMar>
+          </w:tcPr>
+          <w:p>
+            <w:r>
+              <w:rPr>
+                <w:rFonts w:ascii="Arial" w:eastAsia="Microsoft YaHei"/>
+              </w:rPr>
+              <w:t xml:space="preserve">⚠ 缺投影 pack（环境性）</w:t>
+            </w:r>
+          </w:p>
+        </w:tc>
+        <w:tc>
+          <w:tcPr>
+            <w:tcW w:type="dxa" w:w="2256"/>
+            <w:tcBorders>
+              <w:top w:val="single" w:color="CCCCCC" w:sz="1"/>
+              <w:left w:val="single" w:color="CCCCCC" w:sz="1"/>
+              <w:bottom w:val="single" w:color="CCCCCC" w:sz="1"/>
+              <w:right w:val="single" w:color="CCCCCC" w:sz="1"/>
+            </w:tcBorders>
+            <w:tcMar>
+              <w:top w:type="dxa" w:w="80"/>
+              <w:left w:type="dxa" w:w="120"/>
+              <w:bottom w:type="dxa" w:w="80"/>
+              <w:right w:type="dxa" w:w="120"/>
+            </w:tcMar>
+          </w:tcPr>
+          <w:p>
+            <w:r>
+              <w:rPr>
+                <w:rFonts w:ascii="Arial" w:eastAsia="Microsoft YaHei"/>
+              </w:rPr>
+              <w:t xml:space="preserve">需开发机</w:t>
             </w:r>
           </w:p>
         </w:tc>
@@ -2907,7 +3699,7 @@
           <w:b/>
           <w:bCs/>
         </w:rPr>
-        <w:t xml:space="preserve">4.1 契约/回归测试（`dotnet test`）：47/47</w:t>
+        <w:t xml:space="preserve">4.1 契约/回归测试（`dotnet test`）：71/71</w:t>
       </w:r>
     </w:p>
     <w:p>
@@ -2945,7 +3737,7 @@
         <w:rPr>
           <w:rFonts w:ascii="Arial" w:eastAsia="Microsoft YaHei"/>
         </w:rPr>
-        <w:t xml:space="preserve">（HostConfig 默认/JSON+CLI 覆盖/缺文件回落、AdapterFactory 内置与错误路径）；</w:t>
+        <w:t xml:space="preserve">（HostConfig 默认/JSON+CLI 覆盖/缺文件回落、AdapterFactory 内置与错误路径、OCR 引擎反射装配正/反）；</w:t>
       </w:r>
       <w:r>
         <w:rPr>
@@ -2959,7 +3751,63 @@
         <w:rPr>
           <w:rFonts w:ascii="Arial" w:eastAsia="Microsoft YaHei"/>
         </w:rPr>
-        <w:t xml:space="preserve">（§4 帧头打包/解析往返、坏包拒绝、UDP→Concentus→NullRenderer 解码回路 0 丢帧）。</w:t>
+        <w:t xml:space="preserve">（§4 帧头打包/解析往返、坏包拒绝、UDP→Concentus→NullRenderer 解码回路 0 丢帧）；</w:t>
+      </w:r>
+      <w:r>
+        <w:rPr>
+          <w:rFonts w:ascii="Arial" w:eastAsia="Microsoft YaHei"/>
+          <w:b/>
+          <w:bCs/>
+        </w:rPr>
+        <w:t xml:space="preserve">HMAC</w:t>
+      </w:r>
+      <w:r>
+        <w:rPr>
+          <w:rFonts w:ascii="Arial" w:eastAsia="Microsoft YaHei"/>
+        </w:rPr>
+        <w:t xml:space="preserve">（FrameSigner 签名/篡改/错密钥/无签名/稳定 + HostServer 强制入站验签与出站签名集成）；</w:t>
+      </w:r>
+      <w:r>
+        <w:rPr>
+          <w:rFonts w:ascii="Arial" w:eastAsia="Microsoft YaHei"/>
+          <w:b/>
+          <w:bCs/>
+        </w:rPr>
+        <w:t xml:space="preserve">队列</w:t>
+      </w:r>
+      <w:r>
+        <w:rPr>
+          <w:rFonts w:ascii="Arial" w:eastAsia="Microsoft YaHei"/>
+        </w:rPr>
+        <w:t xml:space="preserve">（PlayQueue 增删置顶清空 + queue-updated 事件）；</w:t>
+      </w:r>
+      <w:r>
+        <w:rPr>
+          <w:rFonts w:ascii="Arial" w:eastAsia="Microsoft YaHei"/>
+          <w:b/>
+          <w:bCs/>
+        </w:rPr>
+        <w:t xml:space="preserve">导入</w:t>
+      </w:r>
+      <w:r>
+        <w:rPr>
+          <w:rFonts w:ascii="Arial" w:eastAsia="Microsoft YaHei"/>
+        </w:rPr>
+        <w:t xml:space="preserve">（LocalLibrary 落盘检索 + POST /import→search 命中）；</w:t>
+      </w:r>
+      <w:r>
+        <w:rPr>
+          <w:rFonts w:ascii="Arial" w:eastAsia="Microsoft YaHei"/>
+          <w:b/>
+          <w:bCs/>
+        </w:rPr>
+        <w:t xml:space="preserve">OCR 匹配</w:t>
+      </w:r>
+      <w:r>
+        <w:rPr>
+          <w:rFonts w:ascii="Arial" w:eastAsia="Microsoft YaHei"/>
+        </w:rPr>
+        <w:t xml:space="preserve">（OcrPickStrategy 精确/子串/区域/无匹配）。</w:t>
       </w:r>
     </w:p>
     <w:p>
@@ -3054,6 +3902,104 @@
           <w:rFonts w:ascii="Arial" w:eastAsia="Microsoft YaHei"/>
         </w:rPr>
         <w:t xml:space="preserve">RemoteSim 带 PIN 连上 Host，实测收到 authResult(ok+token)、ack、MediaBus 广播的 state（pos 平滑推进）、searchResults；错 PIN 只回 AUTH_FAILED 且无广播泄露。</w:t>
+      </w:r>
+    </w:p>
+    <w:p>
+      <w:pPr>
+        <w:spacing w:after="120" w:line="360" w:lineRule="auto"/>
+        <w:ind w:firstLine="480"/>
+      </w:pPr>
+      <w:r>
+        <w:rPr>
+          <w:rFonts w:ascii="Arial" w:eastAsia="Microsoft YaHei"/>
+          <w:b/>
+          <w:bCs/>
+        </w:rPr>
+        <w:t xml:space="preserve">4.4 HMAC 端到端联调（`scripts/sig-smoke.sh`）</w:t>
+      </w:r>
+    </w:p>
+    <w:p>
+      <w:pPr>
+        <w:spacing w:after="120" w:line="360" w:lineRule="auto"/>
+        <w:ind w:firstLine="480"/>
+      </w:pPr>
+      <w:r>
+        <w:rPr>
+          <w:rFonts w:ascii="Arial" w:eastAsia="Microsoft YaHei"/>
+        </w:rPr>
+        <w:t xml:space="preserve">起 </w:t>
+      </w:r>
+      <w:r>
+        <w:rPr>
+          <w:rFonts w:ascii="Consolas" w:cs="Consolas" w:eastAsia="Consolas" w:hAnsi="Consolas"/>
+        </w:rPr>
+        <w:t xml:space="preserve">requireFrameSig=true</w:t>
+      </w:r>
+      <w:r>
+        <w:rPr>
+          <w:rFonts w:ascii="Arial" w:eastAsia="Microsoft YaHei"/>
+        </w:rPr>
+        <w:t xml:space="preserve"> 的 Host + </w:t>
+      </w:r>
+      <w:r>
+        <w:rPr>
+          <w:rFonts w:ascii="Consolas" w:cs="Consolas" w:eastAsia="Consolas" w:hAnsi="Consolas"/>
+        </w:rPr>
+        <w:t xml:space="preserve">RemoteSim --sign --verify</w:t>
+      </w:r>
+      <w:r>
+        <w:rPr>
+          <w:rFonts w:ascii="Arial" w:eastAsia="Microsoft YaHei"/>
+        </w:rPr>
+        <w:t xml:space="preserve">：实测 </w:t>
+      </w:r>
+      <w:r>
+        <w:rPr>
+          <w:rFonts w:ascii="Consolas" w:cs="Consolas" w:eastAsia="Consolas" w:hAnsi="Consolas"/>
+        </w:rPr>
+        <w:t xml:space="preserve">authResult</w:t>
+      </w:r>
+      <w:r>
+        <w:rPr>
+          <w:rFonts w:ascii="Arial" w:eastAsia="Microsoft YaHei"/>
+        </w:rPr>
+        <w:t xml:space="preserve"> 带 hostKey、入站签名命令获 </w:t>
+      </w:r>
+      <w:r>
+        <w:rPr>
+          <w:rFonts w:ascii="Consolas" w:cs="Consolas" w:eastAsia="Consolas" w:hAnsi="Consolas"/>
+        </w:rPr>
+        <w:t xml:space="preserve">ack ok=True</w:t>
+      </w:r>
+      <w:r>
+        <w:rPr>
+          <w:rFonts w:ascii="Arial" w:eastAsia="Microsoft YaHei"/>
+        </w:rPr>
+        <w:t xml:space="preserve">（无 AUTH_FAILED）、出站 state/lyric 帧 </w:t>
+      </w:r>
+      <w:r>
+        <w:rPr>
+          <w:rFonts w:ascii="Consolas" w:cs="Consolas" w:eastAsia="Consolas" w:hAnsi="Consolas"/>
+        </w:rPr>
+        <w:t xml:space="preserve">sig=✓</w:t>
+      </w:r>
+      <w:r>
+        <w:rPr>
+          <w:rFonts w:ascii="Arial" w:eastAsia="Microsoft YaHei"/>
+        </w:rPr>
+        <w:t xml:space="preserve">（客户端用 hostKey 验证通过）、无 </w:t>
+      </w:r>
+      <w:r>
+        <w:rPr>
+          <w:rFonts w:ascii="Consolas" w:cs="Consolas" w:eastAsia="Consolas" w:hAnsi="Consolas"/>
+        </w:rPr>
+        <w:t xml:space="preserve">sig=✗</w:t>
+      </w:r>
+      <w:r>
+        <w:rPr>
+          <w:rFonts w:ascii="Arial" w:eastAsia="Microsoft YaHei"/>
+        </w:rPr>
+        <w:t xml:space="preserve">。该脚本已接入 CI 作为回归闸。</w:t>
       </w:r>
     </w:p>
     <w:p>
@@ -6010,7 +6956,94 @@
         <w:rPr>
           <w:rFonts w:ascii="Arial" w:eastAsia="Microsoft YaHei"/>
         </w:rPr>
-        <w:t xml:space="preserve"> 生成逐个 App 能力矩阵。</w:t>
+        <w:t xml:space="preserve"> 生成逐个 App 能力矩阵；</w:t>
+      </w:r>
+    </w:p>
+    <w:p>
+      <w:pPr>
+        <w:pStyle w:val="ListParagraph"/>
+        <w:numPr>
+          <w:ilvl w:val="0"/>
+          <w:numId w:val="3"/>
+        </w:numPr>
+      </w:pPr>
+      <w:r>
+        <w:rPr>
+          <w:rFonts w:ascii="Arial" w:eastAsia="Microsoft YaHei"/>
+        </w:rPr>
+        <w:t xml:space="preserve">用 </w:t>
+      </w:r>
+      <w:r>
+        <w:rPr>
+          <w:rFonts w:ascii="Consolas" w:cs="Consolas" w:eastAsia="Consolas" w:hAnsi="Consolas"/>
+        </w:rPr>
+        <w:t xml:space="preserve">src/SongLink.Tools.UiaProbe</w:t>
+      </w:r>
+      <w:r>
+        <w:rPr>
+          <w:rFonts w:ascii="Arial" w:eastAsia="Microsoft YaHei"/>
+        </w:rPr>
+        <w:t xml:space="preserve"> 的 </w:t>
+      </w:r>
+      <w:r>
+        <w:rPr>
+          <w:rFonts w:ascii="Consolas" w:cs="Consolas" w:eastAsia="Consolas" w:hAnsi="Consolas"/>
+        </w:rPr>
+        <w:t xml:space="preserve">list</w:t>
+      </w:r>
+      <w:r>
+        <w:rPr>
+          <w:rFonts w:ascii="Arial" w:eastAsia="Microsoft YaHei"/>
+        </w:rPr>
+        <w:t xml:space="preserve">/</w:t>
+      </w:r>
+      <w:r>
+        <w:rPr>
+          <w:rFonts w:ascii="Consolas" w:cs="Consolas" w:eastAsia="Consolas" w:hAnsi="Consolas"/>
+        </w:rPr>
+        <w:t xml:space="preserve">dump</w:t>
+      </w:r>
+      <w:r>
+        <w:rPr>
+          <w:rFonts w:ascii="Arial" w:eastAsia="Microsoft YaHei"/>
+        </w:rPr>
+        <w:t xml:space="preserve"> 校准目标 App 的 </w:t>
+      </w:r>
+      <w:r>
+        <w:rPr>
+          <w:rFonts w:ascii="Consolas" w:cs="Consolas" w:eastAsia="Consolas" w:hAnsi="Consolas"/>
+        </w:rPr>
+        <w:t xml:space="preserve">AppDescriptor</w:t>
+      </w:r>
+      <w:r>
+        <w:rPr>
+          <w:rFonts w:ascii="Arial" w:eastAsia="Microsoft YaHei"/>
+        </w:rPr>
+        <w:t xml:space="preserve">（见 </w:t>
+      </w:r>
+      <w:r>
+        <w:rPr>
+          <w:rFonts w:ascii="Consolas" w:cs="Consolas" w:eastAsia="Consolas" w:hAnsi="Consolas"/>
+        </w:rPr>
+        <w:t xml:space="preserve">docs/M2-点歌校准手册.md</w:t>
+      </w:r>
+      <w:r>
+        <w:rPr>
+          <w:rFonts w:ascii="Arial" w:eastAsia="Microsoft YaHei"/>
+        </w:rPr>
+        <w:t xml:space="preserve">），再 </w:t>
+      </w:r>
+      <w:r>
+        <w:rPr>
+          <w:rFonts w:ascii="Consolas" w:cs="Consolas" w:eastAsia="Consolas" w:hAnsi="Consolas"/>
+        </w:rPr>
+        <w:t xml:space="preserve">--adapter uia</w:t>
+      </w:r>
+      <w:r>
+        <w:rPr>
+          <w:rFonts w:ascii="Arial" w:eastAsia="Microsoft YaHei"/>
+        </w:rPr>
+        <w:t xml:space="preserve"> 点歌验证。</w:t>
       </w:r>
     </w:p>
     <w:p>
@@ -6110,7 +7143,19 @@
         <w:rPr>
           <w:rFonts w:ascii="Arial" w:eastAsia="Microsoft YaHei"/>
         </w:rPr>
-        <w:t xml:space="preserve"> + CI、Host 组合根配置化、音频串流并入；剩余可继续：RemoteSim 升级为更完整桌面参考端、每帧 HMAC/wss 加固、</w:t>
+        <w:t xml:space="preserve">+CI、组合根配置化、音频串流并入、HMAC 入/出站签名 + </w:t>
+      </w:r>
+      <w:r>
+        <w:rPr>
+          <w:rFonts w:ascii="Consolas" w:cs="Consolas" w:eastAsia="Consolas" w:hAnsi="Consolas"/>
+        </w:rPr>
+        <w:t xml:space="preserve">sig-smoke</w:t>
+      </w:r>
+      <w:r>
+        <w:rPr>
+          <w:rFonts w:ascii="Arial" w:eastAsia="Microsoft YaHei"/>
+        </w:rPr>
+        <w:t xml:space="preserve"> CI、</w:t>
       </w:r>
       <w:r>
         <w:rPr>
@@ -6122,7 +7167,7 @@
         <w:rPr>
           <w:rFonts w:ascii="Arial" w:eastAsia="Microsoft YaHei"/>
         </w:rPr>
-        <w:t xml:space="preserve">/</w:t>
+        <w:t xml:space="preserve">、</w:t>
       </w:r>
       <w:r>
         <w:rPr>
@@ -6134,7 +7179,43 @@
         <w:rPr>
           <w:rFonts w:ascii="Arial" w:eastAsia="Microsoft YaHei"/>
         </w:rPr>
-        <w:t xml:space="preserve"> 实现。</w:t>
+        <w:t xml:space="preserve">、</w:t>
+      </w:r>
+      <w:r>
+        <w:rPr>
+          <w:rFonts w:ascii="Consolas" w:cs="Consolas" w:eastAsia="Consolas" w:hAnsi="Consolas"/>
+        </w:rPr>
+        <w:t xml:space="preserve">UiaProbe</w:t>
+      </w:r>
+      <w:r>
+        <w:rPr>
+          <w:rFonts w:ascii="Arial" w:eastAsia="Microsoft YaHei"/>
+        </w:rPr>
+        <w:t xml:space="preserve"> 校准工具、</w:t>
+      </w:r>
+      <w:r>
+        <w:rPr>
+          <w:rFonts w:ascii="Consolas" w:cs="Consolas" w:eastAsia="Consolas" w:hAnsi="Consolas"/>
+        </w:rPr>
+        <w:t xml:space="preserve">.editorconfig</w:t>
+      </w:r>
+      <w:r>
+        <w:rPr>
+          <w:rFonts w:ascii="Arial" w:eastAsia="Microsoft YaHei"/>
+        </w:rPr>
+        <w:t xml:space="preserve">/分析器；剩余可继续：wss 传输加密、</w:t>
+      </w:r>
+      <w:r>
+        <w:rPr>
+          <w:rFonts w:ascii="Consolas" w:cs="Consolas" w:eastAsia="Consolas" w:hAnsi="Consolas"/>
+        </w:rPr>
+        <w:t xml:space="preserve">LocalSource</w:t>
+      </w:r>
+      <w:r>
+        <w:rPr>
+          <w:rFonts w:ascii="Arial" w:eastAsia="Microsoft YaHei"/>
+        </w:rPr>
+        <w:t xml:space="preserve"> 适配器（播放导入音源）、RemoteSim 进一步产品化。</w:t>
       </w:r>
     </w:p>
     <w:p>

</xml_diff>